<commit_message>
Added Figure S3 and submitted first proof
</commit_message>
<xml_diff>
--- a/Manuscript/Quantitative Plant Biology/Proof/Manuscript.docx
+++ b/Manuscript/Quantitative Plant Biology/Proof/Manuscript.docx
@@ -2742,13 +2742,7 @@
         <w:rPr>
           <w:rFonts w:ascii="Times New Roman" w:hAnsi="Times New Roman" w:cs="Times New Roman"/>
         </w:rPr>
-        <w:t xml:space="preserve"> as </w:t>
-      </w:r>
-      <w:r>
-        <w:rPr>
-          <w:rFonts w:ascii="Times New Roman" w:hAnsi="Times New Roman" w:cs="Times New Roman"/>
-        </w:rPr>
-        <w:t>photosynthetic half-life</w:t>
+        <w:t xml:space="preserve"> as photosynthetic half-life</w:t>
       </w:r>
       <w:r>
         <w:rPr>
@@ -3558,13 +3552,7 @@
         <w:rPr>
           <w:rFonts w:ascii="Times New Roman" w:hAnsi="Times New Roman" w:cs="Times New Roman"/>
         </w:rPr>
-        <w:t xml:space="preserve"> is known to be 1</w:t>
-      </w:r>
-      <w:r>
-        <w:rPr>
-          <w:rFonts w:ascii="Times New Roman" w:hAnsi="Times New Roman" w:cs="Times New Roman"/>
-        </w:rPr>
-        <w:t xml:space="preserve"> </w:t>
+        <w:t xml:space="preserve"> is known to be 1 </w:t>
       </w:r>
       <w:r>
         <w:rPr>
@@ -4901,16 +4889,7 @@
           <w:rPr>
             <w:rFonts w:ascii="Times New Roman" w:hAnsi="Times New Roman" w:cs="Times New Roman"/>
           </w:rPr>
-          <m:t>SEM</m:t>
-        </m:r>
-        <m:r>
-          <m:rPr>
-            <m:nor/>
-          </m:rPr>
-          <w:rPr>
-            <w:rFonts w:ascii="Times New Roman" w:hAnsi="Times New Roman" w:cs="Times New Roman"/>
-          </w:rPr>
-          <m:t xml:space="preserve"> = </m:t>
+          <m:t xml:space="preserve">SEM = </m:t>
         </m:r>
         <m:f>
           <m:fPr>
@@ -4973,16 +4952,7 @@
           <w:rPr>
             <w:rFonts w:ascii="Times New Roman" w:hAnsi="Times New Roman" w:cs="Times New Roman"/>
           </w:rPr>
-          <m:t>SEM</m:t>
-        </m:r>
-        <m:r>
-          <m:rPr>
-            <m:nor/>
-          </m:rPr>
-          <w:rPr>
-            <w:rFonts w:ascii="Times New Roman" w:hAnsi="Times New Roman" w:cs="Times New Roman"/>
-          </w:rPr>
-          <m:t xml:space="preserve"> = </m:t>
+          <m:t xml:space="preserve">SEM = </m:t>
         </m:r>
         <m:f>
           <m:fPr>
@@ -5212,16 +5182,7 @@
           <w:rPr>
             <w:rFonts w:ascii="Times New Roman" w:hAnsi="Times New Roman" w:cs="Times New Roman"/>
           </w:rPr>
-          <m:t>SEM</m:t>
-        </m:r>
-        <m:r>
-          <m:rPr>
-            <m:nor/>
-          </m:rPr>
-          <w:rPr>
-            <w:rFonts w:ascii="Times New Roman" w:hAnsi="Times New Roman" w:cs="Times New Roman"/>
-          </w:rPr>
-          <m:t xml:space="preserve"> = </m:t>
+          <m:t xml:space="preserve">SEM = </m:t>
         </m:r>
         <m:f>
           <m:fPr>
@@ -9111,21 +9072,7 @@
         <w:rPr>
           <w:rFonts w:ascii="Times New Roman" w:hAnsi="Times New Roman" w:cs="Times New Roman"/>
         </w:rPr>
-        <w:t xml:space="preserve"> and implemented with </w:t>
-      </w:r>
-      <w:proofErr w:type="spellStart"/>
-      <w:r>
-        <w:rPr>
-          <w:rFonts w:ascii="Times New Roman" w:hAnsi="Times New Roman" w:cs="Times New Roman"/>
-        </w:rPr>
-        <w:t>CmdStan</w:t>
-      </w:r>
-      <w:proofErr w:type="spellEnd"/>
-      <w:r>
-        <w:rPr>
-          <w:rFonts w:ascii="Times New Roman" w:hAnsi="Times New Roman" w:cs="Times New Roman"/>
-        </w:rPr>
-        <w:t xml:space="preserve"> v2.17.1 </w:t>
+        <w:t xml:space="preserve"> and implemented with CmdStan v2.17.1 </w:t>
       </w:r>
       <w:r>
         <w:rPr>
@@ -10939,13 +10886,7 @@
         <w:rPr>
           <w:rFonts w:ascii="Times New Roman" w:hAnsi="Times New Roman" w:cs="Times New Roman"/>
         </w:rPr>
-        <w:t>These observations</w:t>
-      </w:r>
-      <w:r>
-        <w:rPr>
-          <w:rFonts w:ascii="Times New Roman" w:hAnsi="Times New Roman" w:cs="Times New Roman"/>
-        </w:rPr>
-        <w:t xml:space="preserve"> cast some doubt on the apparent greater photosynthetic </w:t>
+        <w:t xml:space="preserve">These observations cast some doubt on the apparent greater photosynthetic </w:t>
       </w:r>
       <w:r>
         <w:rPr>
@@ -11130,7 +11071,26 @@
         <w:rPr>
           <w:rFonts w:ascii="Times New Roman" w:hAnsi="Times New Roman" w:cs="Times New Roman"/>
         </w:rPr>
-        <w:t>Across light conditions and response variables, the median half-life of detrital photosynthesis ranges from 11 days for terrestrial plants, over 14 and 17 days for freshwater plants and seagrasses to 44 days for seaweeds (Table 2). The prediction for unobserved plant groups is 17 days (ln = 2.8 ± 1.1). In relative terms, seaweed detrital photosynthesis persists 3.9, 3.1, and 2.5 times as long as that of terrestrial plants, freshwater plants and seagrasses (Table 3, Figure S2). All vascular plant detritus remains viable for similar durations but there is a tendency for that of freshwater plants to have a somewhat longer photosynthetic half-life compared to terrestrial plants, with that of seagrasses being longer still (Table 3, Figure S2).</w:t>
+        <w:t xml:space="preserve">Across light conditions and response variables, the median half-life of detrital photosynthesis ranges from 11 days for terrestrial plants, over 14 and 17 days for freshwater plants and seagrasses to 44 days for seaweeds (Table 2). The prediction for unobserved plant groups is 17 days (ln = 2.8 ± 1.1). In relative terms, seaweed detrital photosynthesis persists 3.9, 3.1, and 2.5 times as long as that of terrestrial plants, freshwater plants and seagrasses (Table 3, Figure S2). All vascular plant detritus remains viable for similar durations but there is a tendency for that of freshwater plants to have a somewhat longer </w:t>
+      </w:r>
+      <w:r>
+        <w:rPr>
+          <w:rFonts w:ascii="Times New Roman" w:hAnsi="Times New Roman" w:cs="Times New Roman"/>
+        </w:rPr>
+        <w:t>photosynthetic half-life compared to terrestrial plants, with that of seagrasses being longer still (Table 3, Figure S2).</w:t>
+      </w:r>
+      <w:r>
+        <w:rPr>
+          <w:rFonts w:ascii="Times New Roman" w:hAnsi="Times New Roman" w:cs="Times New Roman"/>
+        </w:rPr>
+        <w:t xml:space="preserve"> </w:t>
+      </w:r>
+      <w:r>
+        <w:rPr>
+          <w:rStyle w:val="inserted"/>
+          <w:rFonts w:ascii="Times New Roman" w:hAnsi="Times New Roman" w:cs="Times New Roman"/>
+        </w:rPr>
+        <w:t>Without water, terrestrial plant detrital photosynthesis decays within minutes (Figure S3).</w:t>
       </w:r>
     </w:p>
     <w:p>
@@ -11193,14 +11153,14 @@
         <w:rPr>
           <w:rFonts w:ascii="Times New Roman" w:hAnsi="Times New Roman" w:cs="Times New Roman"/>
         </w:rPr>
-        <w:t xml:space="preserve"> (Table S3). Median estimates for experiments range from 1.2 to 438 days. The variance in </w:t>
+        <w:t xml:space="preserve"> </w:t>
       </w:r>
       <w:r>
         <w:rPr>
           <w:rFonts w:ascii="Times New Roman" w:hAnsi="Times New Roman" w:cs="Times New Roman"/>
         </w:rPr>
         <w:lastRenderedPageBreak/>
-        <w:t>photosynthetic half-life between plant groups, species and experiments is directly quantified by</w:t>
+        <w:t>(Table S3). Median estimates for experiments range from 1.2 to 438 days. The variance in photosynthetic half-life between plant groups, species and experiments is directly quantified by</w:t>
       </w:r>
       <w:r>
         <w:rPr>
@@ -11473,14 +11433,14 @@
         <w:rPr>
           <w:rFonts w:ascii="Times New Roman" w:hAnsi="Times New Roman" w:cs="Times New Roman"/>
         </w:rPr>
-        <w:t xml:space="preserve">Some plant detritus can maintain photosynthesis for long periods following detachment. This is at odds with conventional understanding of detritus as dead organic matter. Despite the existence of various relevant literature published on this topic since the 1950s and recognition of the phenomenon in seaweeds since the 1980s, detrital photosynthesis had not been explored beyond kelps or formally conceptualised. In part, this is probably due to diverse research objectives and terminology which obscure the connection between quantitatively comparable data. There was also data scarcity for seagrasses which, as the only vascular counterpart to seaweeds, form an important functional link to freshwater and terrestrial plants. Here, I collected the first data on </w:t>
+        <w:t xml:space="preserve">Some plant detritus can maintain photosynthesis for long periods following detachment. This is at odds with conventional understanding of detritus as dead organic matter. Despite the existence of various relevant literature published on this topic since the 1950s and recognition of the phenomenon in seaweeds since the 1980s, detrital photosynthesis had not been explored beyond kelps or formally conceptualised. In part, this is probably due to diverse research objectives and terminology which obscure the connection between quantitatively comparable data. There was also data scarcity for seagrasses which, as the only vascular counterpart to seaweeds, form an </w:t>
       </w:r>
       <w:r>
         <w:rPr>
           <w:rFonts w:ascii="Times New Roman" w:hAnsi="Times New Roman" w:cs="Times New Roman"/>
         </w:rPr>
         <w:lastRenderedPageBreak/>
-        <w:t>photosynthesis in seagrass detritus, developed a mathematical model of detrital photosynthesis and used it to make the first quantitative comparison of photosynthetic persistence in the detrital phase of various plants. Results suggest that the non-vascular macroalgae have the greatest potential for detrital photosynthesis while among the vascular plants there is slightly increased detrital viability with a shift from a terrestrial to an aquatic and yet again to a marine lifestyle. Although all plants display detrital photosynthesis to some extent, it does not necessarily influence their decomposition. Terrestrial plant decomposition is slower than that of aquatic vascular plants which in turn is much slower than that of macroalgae. I predict that detrital photosynthesis is a general phenomenon but its effect on decomposition ranges from negligible for terrestrial plants, over measurable for aquatic vascular plants, to substantial for macroalgae. It is conceivable that detrital photosynthesis determines macroalgal decomposition. I therefore propose a new causal model of macroalgal decomposition that emerges from my formalisation of the theory of detrital photosynthesis (Figure 4). While conventional decomposition theory may continue to be applied to vascular plants and detritus sensu stricto, its assumptions will not always hold for aquatic systems and certainly do not apply to macroalgae (Figure 4).</w:t>
+        <w:t>important functional link to freshwater and terrestrial plants. Here, I collected the first data on photosynthesis in seagrass detritus, developed a mathematical model of detrital photosynthesis and used it to make the first quantitative comparison of photosynthetic persistence in the detrital phase of various plants. Results suggest that the non-vascular macroalgae have the greatest potential for detrital photosynthesis while among the vascular plants there is slightly increased detrital viability with a shift from a terrestrial to an aquatic and yet again to a marine lifestyle. Although all plants display detrital photosynthesis to some extent, it does not necessarily influence their decomposition. Terrestrial plant decomposition is slower than that of aquatic vascular plants which in turn is much slower than that of macroalgae. I predict that detrital photosynthesis is a general phenomenon but its effect on decomposition ranges from negligible for terrestrial plants, over measurable for aquatic vascular plants, to substantial for macroalgae. It is conceivable that detrital photosynthesis determines macroalgal decomposition. I therefore propose a new causal model of macroalgal decomposition that emerges from my formalisation of the theory of detrital photosynthesis (Figure 4). While conventional decomposition theory may continue to be applied to vascular plants and detritus sensu stricto, its assumptions will not always hold for aquatic systems and certainly do not apply to macroalgae (Figure 4).</w:t>
       </w:r>
     </w:p>
     <w:p>
@@ -11974,14 +11934,14 @@
         <w:rPr>
           <w:rFonts w:ascii="Times New Roman" w:hAnsi="Times New Roman" w:cs="Times New Roman"/>
         </w:rPr>
-        <w:t xml:space="preserve"> for up to a month and my evidence of photosynthetic persistence for a similar duration, seagrass detrital photosynthesis may not </w:t>
+        <w:t xml:space="preserve"> for up to a month and my evidence of </w:t>
       </w:r>
       <w:r>
         <w:rPr>
           <w:rFonts w:ascii="Times New Roman" w:hAnsi="Times New Roman" w:cs="Times New Roman"/>
         </w:rPr>
         <w:lastRenderedPageBreak/>
-        <w:t xml:space="preserve">necessarily counteract decomposition. I found that seagrass detritus has a detrital half-life of 68 days on average and </w:t>
+        <w:t xml:space="preserve">photosynthetic persistence for a similar duration, seagrass detrital photosynthesis may not necessarily counteract decomposition. I found that seagrass detritus has a detrital half-life of 68 days on average and </w:t>
       </w:r>
       <w:r>
         <w:rPr>
@@ -12047,13 +12007,7 @@
         <w:rPr>
           <w:rFonts w:ascii="Times New Roman" w:hAnsi="Times New Roman" w:cs="Times New Roman"/>
         </w:rPr>
-        <w:t>vegetative fragments</w:t>
-      </w:r>
-      <w:r>
-        <w:rPr>
-          <w:rFonts w:ascii="Times New Roman" w:hAnsi="Times New Roman" w:cs="Times New Roman"/>
-        </w:rPr>
-        <w:t xml:space="preserve"> of</w:t>
+        <w:t>vegetative fragments of</w:t>
       </w:r>
       <w:r>
         <w:rPr>
@@ -12301,7 +12255,31 @@
         <w:rPr>
           <w:rFonts w:ascii="Times New Roman" w:hAnsi="Times New Roman" w:cs="Times New Roman"/>
         </w:rPr>
-        <w:t xml:space="preserve"> fate of terrestrial plant detritus, detached leaves of various trees tend to lose the ability to photosynthesise in just a few minutes (e.g. </w:t>
+        <w:t xml:space="preserve"> fate of terrestrial plant detritus, detached leaves of various trees tend to lose the ability to photosynthesise in just a few minutes (</w:t>
+      </w:r>
+      <w:r>
+        <w:rPr>
+          <w:rFonts w:ascii="Times New Roman" w:hAnsi="Times New Roman" w:cs="Times New Roman"/>
+        </w:rPr>
+        <w:t>Figure S3,</w:t>
+      </w:r>
+      <w:r>
+        <w:rPr>
+          <w:rFonts w:ascii="Times New Roman" w:hAnsi="Times New Roman" w:cs="Times New Roman"/>
+        </w:rPr>
+        <w:t xml:space="preserve"> </w:t>
+      </w:r>
+      <w:r>
+        <w:rPr>
+          <w:rFonts w:ascii="Times New Roman" w:hAnsi="Times New Roman" w:cs="Times New Roman"/>
+        </w:rPr>
+        <w:t>e.g.</w:t>
+      </w:r>
+      <w:r>
+        <w:rPr>
+          <w:rFonts w:ascii="Times New Roman" w:hAnsi="Times New Roman" w:cs="Times New Roman"/>
+        </w:rPr>
+        <w:t xml:space="preserve"> </w:t>
       </w:r>
       <w:r>
         <w:rPr>
@@ -12495,14 +12473,14 @@
         <w:rPr>
           <w:rFonts w:ascii="Times New Roman" w:hAnsi="Times New Roman" w:cs="Times New Roman"/>
         </w:rPr>
-        <w:t xml:space="preserve">, hydrogen peroxide production is exacerbated by photosynthesis, leading to light-induced chlorophyll degradation that is independent of photodegradation. Hence freshwater plants were the only group for which I did not find a positive light effect on </w:t>
+        <w:t xml:space="preserve">, hydrogen peroxide production is exacerbated by photosynthesis, leading to light-induced chlorophyll degradation that is independent of photodegradation. Hence </w:t>
       </w:r>
       <w:r>
         <w:rPr>
           <w:rFonts w:ascii="Times New Roman" w:hAnsi="Times New Roman" w:cs="Times New Roman"/>
         </w:rPr>
         <w:lastRenderedPageBreak/>
-        <w:t>photosynthetic half-life</w:t>
+        <w:t>freshwater plants were the only group for which I did not find a positive light effect on photosynthetic half-life</w:t>
       </w:r>
       <w:r>
         <w:rPr>
@@ -12998,7 +12976,14 @@
         <w:rPr>
           <w:rFonts w:ascii="Times New Roman" w:hAnsi="Times New Roman" w:cs="Times New Roman"/>
         </w:rPr>
-        <w:t xml:space="preserve"> a mechanism contrary to photodegradation. In this case the mechanism is clear, but </w:t>
+        <w:t xml:space="preserve"> a mechanism contrary to photodegradation. In this case the mechanism </w:t>
+      </w:r>
+      <w:r>
+        <w:rPr>
+          <w:rFonts w:ascii="Times New Roman" w:hAnsi="Times New Roman" w:cs="Times New Roman"/>
+        </w:rPr>
+        <w:lastRenderedPageBreak/>
+        <w:t xml:space="preserve">is clear, but </w:t>
       </w:r>
       <w:r>
         <w:rPr>
@@ -13040,20 +13025,540 @@
         <w:rPr>
           <w:rFonts w:ascii="Times New Roman" w:hAnsi="Times New Roman" w:cs="Times New Roman"/>
         </w:rPr>
-        <w:t xml:space="preserve">, </w:t>
+        <w:t>, e</w:t>
+      </w:r>
+      <w:r>
+        <w:rPr>
+          <w:rFonts w:ascii="Times New Roman" w:hAnsi="Times New Roman" w:cs="Times New Roman"/>
+        </w:rPr>
+        <w:t xml:space="preserve">levated temperature may accelerate decomposition in three ways: by reducing the structural integrity of detritus, by increasing decomposer metabolism, and also by diminishing detrital photosynthesis as was recently demonstrated </w:t>
+      </w:r>
+      <w:r>
+        <w:rPr>
+          <w:rFonts w:ascii="Times New Roman" w:hAnsi="Times New Roman" w:cs="Times New Roman"/>
+        </w:rPr>
+        <w:fldChar w:fldCharType="begin"/>
+      </w:r>
+      <w:r>
+        <w:rPr>
+          <w:rFonts w:ascii="Times New Roman" w:hAnsi="Times New Roman" w:cs="Times New Roman"/>
+        </w:rPr>
+        <w:instrText>ADDIN BEC{Wright et al., 2024 #11375}</w:instrText>
+      </w:r>
+      <w:r>
+        <w:rPr>
+          <w:rFonts w:ascii="Times New Roman" w:hAnsi="Times New Roman" w:cs="Times New Roman"/>
+        </w:rPr>
+        <w:fldChar w:fldCharType="separate"/>
+      </w:r>
+      <w:r>
+        <w:rPr>
+          <w:rFonts w:ascii="Times New Roman" w:hAnsi="Times New Roman" w:cs="Times New Roman"/>
+        </w:rPr>
+        <w:t>(Wright et al. 2024)</w:t>
+      </w:r>
+      <w:r>
+        <w:rPr>
+          <w:rFonts w:ascii="Times New Roman" w:hAnsi="Times New Roman" w:cs="Times New Roman"/>
+        </w:rPr>
+        <w:fldChar w:fldCharType="end"/>
+      </w:r>
+      <w:r>
+        <w:rPr>
+          <w:rFonts w:ascii="Times New Roman" w:hAnsi="Times New Roman" w:cs="Times New Roman"/>
+        </w:rPr>
+        <w:t>. Further research is required to tease apart these causal relationships.</w:t>
+      </w:r>
+    </w:p>
+    <w:p>
+      <w:pPr>
+        <w:spacing w:line="360" w:lineRule="auto"/>
+        <w:rPr>
+          <w:rFonts w:ascii="Times New Roman" w:hAnsi="Times New Roman" w:cs="Times New Roman"/>
+        </w:rPr>
+      </w:pPr>
+    </w:p>
+    <w:p>
+      <w:pPr>
+        <w:spacing w:line="360" w:lineRule="auto"/>
+        <w:rPr>
+          <w:rFonts w:ascii="Times New Roman" w:hAnsi="Times New Roman" w:cs="Times New Roman"/>
+        </w:rPr>
+      </w:pPr>
+      <w:r>
+        <w:rPr>
+          <w:rFonts w:ascii="Times New Roman" w:hAnsi="Times New Roman" w:cs="Times New Roman"/>
+        </w:rPr>
+        <w:t xml:space="preserve">Detrital photosynthesis should be considered when making inferences about </w:t>
+      </w:r>
+      <w:r>
+        <w:rPr>
+          <w:rFonts w:ascii="Times New Roman" w:hAnsi="Times New Roman" w:cs="Times New Roman"/>
+        </w:rPr>
+        <w:t>macroalgal</w:t>
+      </w:r>
+      <w:r>
+        <w:rPr>
+          <w:rFonts w:ascii="Times New Roman" w:hAnsi="Times New Roman" w:cs="Times New Roman"/>
+        </w:rPr>
+        <w:t xml:space="preserve"> decomposition. Firstly, the initial physiological state of detritus in a decomposition experiment may not reflect that in nature. In contrast to seagrass litter bag experiments </w:t>
+      </w:r>
+      <w:r>
+        <w:rPr>
+          <w:rFonts w:ascii="Times New Roman" w:hAnsi="Times New Roman" w:cs="Times New Roman"/>
+        </w:rPr>
+        <w:fldChar w:fldCharType="begin"/>
+      </w:r>
+      <w:r>
+        <w:rPr>
+          <w:rFonts w:ascii="Times New Roman" w:hAnsi="Times New Roman" w:cs="Times New Roman"/>
+        </w:rPr>
+        <w:instrText>ADDIN BEC{Harrison, 1989 #14810; Trevathan-Tackett et al., 2020 #39238}</w:instrText>
+      </w:r>
+      <w:r>
+        <w:rPr>
+          <w:rFonts w:ascii="Times New Roman" w:hAnsi="Times New Roman" w:cs="Times New Roman"/>
+        </w:rPr>
+        <w:fldChar w:fldCharType="separate"/>
+      </w:r>
+      <w:r>
+        <w:rPr>
+          <w:rFonts w:ascii="Times New Roman" w:hAnsi="Times New Roman" w:cs="Times New Roman"/>
+        </w:rPr>
+        <w:t>(Harrison 1989, Trevathan-Tackett et al. 2020)</w:t>
+      </w:r>
+      <w:r>
+        <w:rPr>
+          <w:rFonts w:ascii="Times New Roman" w:hAnsi="Times New Roman" w:cs="Times New Roman"/>
+        </w:rPr>
+        <w:fldChar w:fldCharType="end"/>
+      </w:r>
+      <w:r>
+        <w:rPr>
+          <w:rFonts w:ascii="Times New Roman" w:hAnsi="Times New Roman" w:cs="Times New Roman"/>
+        </w:rPr>
+        <w:t xml:space="preserve">, most seaweed decomposition experiments have </w:t>
+      </w:r>
+      <w:r>
+        <w:rPr>
+          <w:rFonts w:ascii="Times New Roman" w:hAnsi="Times New Roman" w:cs="Times New Roman"/>
+        </w:rPr>
+        <w:t xml:space="preserve">only </w:t>
+      </w:r>
+      <w:r>
+        <w:rPr>
+          <w:rFonts w:ascii="Times New Roman" w:hAnsi="Times New Roman" w:cs="Times New Roman"/>
+        </w:rPr>
+        <w:t xml:space="preserve">used freshly excised blades as a detritus proxy </w:t>
+      </w:r>
+      <w:r>
+        <w:rPr>
+          <w:rFonts w:ascii="Times New Roman" w:hAnsi="Times New Roman" w:cs="Times New Roman"/>
+        </w:rPr>
+        <w:fldChar w:fldCharType="begin"/>
+      </w:r>
+      <w:r>
+        <w:rPr>
+          <w:rFonts w:ascii="Times New Roman" w:hAnsi="Times New Roman" w:cs="Times New Roman"/>
+        </w:rPr>
+        <w:instrText>ADDIN BEC{Hamersley et al., 2015 #100188; de Bettignies et al., 2020 #27484}{Frontier et al., 2021 #5570; Frontier et al., 2022 #81381; Wright et al., 2022 #84779; Filbee-Dexter et al., 2022 #89942; Kennedy and Blain, 2025 #108523; White and Norkko, 2025 #37663}</w:instrText>
+      </w:r>
+      <w:r>
+        <w:rPr>
+          <w:rFonts w:ascii="Times New Roman" w:hAnsi="Times New Roman" w:cs="Times New Roman"/>
+        </w:rPr>
+        <w:fldChar w:fldCharType="separate"/>
+      </w:r>
+      <w:r>
+        <w:rPr>
+          <w:rFonts w:ascii="Times New Roman" w:hAnsi="Times New Roman" w:cs="Times New Roman"/>
+        </w:rPr>
+        <w:t>(Frontier et al. 2021, Filbee-Dexter et al. 2022, Frontier et al. 2022, Wright et al. 2022, Kennedy &amp; Blain 2025, White &amp; Norkko 2025)</w:t>
+      </w:r>
+      <w:r>
+        <w:rPr>
+          <w:rFonts w:ascii="Times New Roman" w:hAnsi="Times New Roman" w:cs="Times New Roman"/>
+        </w:rPr>
+        <w:fldChar w:fldCharType="end"/>
+      </w:r>
+      <w:r>
+        <w:rPr>
+          <w:rFonts w:ascii="Times New Roman" w:hAnsi="Times New Roman" w:cs="Times New Roman"/>
+        </w:rPr>
+        <w:t xml:space="preserve">. Senescent or naturally detached fronds are rarely included </w:t>
+      </w:r>
+      <w:r>
+        <w:rPr>
+          <w:rFonts w:ascii="Times New Roman" w:hAnsi="Times New Roman" w:cs="Times New Roman"/>
+        </w:rPr>
+        <w:fldChar w:fldCharType="begin"/>
+      </w:r>
+      <w:r>
+        <w:rPr>
+          <w:rFonts w:ascii="Times New Roman" w:hAnsi="Times New Roman" w:cs="Times New Roman"/>
+        </w:rPr>
+        <w:instrText>ADDIN BEC{Hamersley et al., 2015 #100188; de Bettignies et al., 2020 #27484}</w:instrText>
+      </w:r>
+      <w:r>
+        <w:rPr>
+          <w:rFonts w:ascii="Times New Roman" w:hAnsi="Times New Roman" w:cs="Times New Roman"/>
+        </w:rPr>
+        <w:fldChar w:fldCharType="separate"/>
+      </w:r>
+      <w:r>
+        <w:rPr>
+          <w:rFonts w:ascii="Times New Roman" w:hAnsi="Times New Roman" w:cs="Times New Roman"/>
+        </w:rPr>
+        <w:t>(Hamersley et al. 2015, de Bettignies et al. 2020)</w:t>
+      </w:r>
+      <w:r>
+        <w:rPr>
+          <w:rFonts w:ascii="Times New Roman" w:hAnsi="Times New Roman" w:cs="Times New Roman"/>
+        </w:rPr>
+        <w:fldChar w:fldCharType="end"/>
+      </w:r>
+      <w:r>
+        <w:rPr>
+          <w:rFonts w:ascii="Times New Roman" w:hAnsi="Times New Roman" w:cs="Times New Roman"/>
+        </w:rPr>
+        <w:t xml:space="preserve"> and the practice of pre-killing tissue to obtain detritus sensu stricto is </w:t>
+      </w:r>
+      <w:r>
+        <w:rPr>
+          <w:rFonts w:ascii="Times New Roman" w:hAnsi="Times New Roman" w:cs="Times New Roman"/>
+        </w:rPr>
+        <w:t>limited</w:t>
+      </w:r>
+      <w:r>
+        <w:rPr>
+          <w:rFonts w:ascii="Times New Roman" w:hAnsi="Times New Roman" w:cs="Times New Roman"/>
+        </w:rPr>
+        <w:t xml:space="preserve"> to few, mostly early studies </w:t>
+      </w:r>
+      <w:r>
+        <w:rPr>
+          <w:rFonts w:ascii="Times New Roman" w:hAnsi="Times New Roman" w:cs="Times New Roman"/>
+        </w:rPr>
+        <w:fldChar w:fldCharType="begin"/>
+      </w:r>
+      <w:r>
+        <w:rPr>
+          <w:rFonts w:ascii="Times New Roman" w:hAnsi="Times New Roman" w:cs="Times New Roman"/>
+        </w:rPr>
+        <w:instrText>ADDIN BEC{Josselyn and Mathieson, 1980 #46927; Rice and Tenore, 1981 #62280; Birch et al., 1983 #5321; Smith and Foreman, 1984 #41137; Brouwer, 1996 #26706}</w:instrText>
+      </w:r>
+      <w:r>
+        <w:rPr>
+          <w:rFonts w:ascii="Times New Roman" w:hAnsi="Times New Roman" w:cs="Times New Roman"/>
+        </w:rPr>
+        <w:fldChar w:fldCharType="separate"/>
+      </w:r>
+      <w:r>
+        <w:rPr>
+          <w:rFonts w:ascii="Times New Roman" w:hAnsi="Times New Roman" w:cs="Times New Roman"/>
+        </w:rPr>
+        <w:t>(Josselyn &amp; Mathieson 1980, Rice &amp; Tenore 1981, Birch et al. 1983, Smith &amp; Foreman 1984, Brouwer 1996)</w:t>
+      </w:r>
+      <w:r>
+        <w:rPr>
+          <w:rFonts w:ascii="Times New Roman" w:hAnsi="Times New Roman" w:cs="Times New Roman"/>
+        </w:rPr>
+        <w:fldChar w:fldCharType="end"/>
+      </w:r>
+      <w:r>
+        <w:rPr>
+          <w:rFonts w:ascii="Times New Roman" w:hAnsi="Times New Roman" w:cs="Times New Roman"/>
+        </w:rPr>
+        <w:t xml:space="preserve">. While the fraction of seaweed detritus that consists of whole dislodged plants or fronds is certainly initially viable, the majority of tissue that is abscised or eroded likely </w:t>
+      </w:r>
+      <w:r>
+        <w:rPr>
+          <w:rFonts w:ascii="Times New Roman" w:hAnsi="Times New Roman" w:cs="Times New Roman"/>
+        </w:rPr>
+        <w:t xml:space="preserve">already </w:t>
+      </w:r>
+      <w:r>
+        <w:rPr>
+          <w:rFonts w:ascii="Times New Roman" w:hAnsi="Times New Roman" w:cs="Times New Roman"/>
+        </w:rPr>
+        <w:t xml:space="preserve">exhibits impaired photosynthesis </w:t>
+      </w:r>
+      <w:r>
+        <w:rPr>
+          <w:rFonts w:ascii="Times New Roman" w:hAnsi="Times New Roman" w:cs="Times New Roman"/>
+        </w:rPr>
+        <w:t>before</w:t>
+      </w:r>
+      <w:r>
+        <w:rPr>
+          <w:rFonts w:ascii="Times New Roman" w:hAnsi="Times New Roman" w:cs="Times New Roman"/>
+        </w:rPr>
+        <w:t xml:space="preserve"> detachment</w:t>
+      </w:r>
+      <w:r>
+        <w:rPr>
+          <w:rFonts w:ascii="Times New Roman" w:hAnsi="Times New Roman" w:cs="Times New Roman"/>
+        </w:rPr>
+        <w:t xml:space="preserve"> </w:t>
+      </w:r>
+      <w:r>
+        <w:rPr>
+          <w:rFonts w:ascii="Times New Roman" w:hAnsi="Times New Roman" w:cs="Times New Roman"/>
+        </w:rPr>
+        <w:fldChar w:fldCharType="begin"/>
+      </w:r>
+      <w:r>
+        <w:rPr>
+          <w:rFonts w:ascii="Times New Roman" w:hAnsi="Times New Roman" w:cs="Times New Roman"/>
+        </w:rPr>
+        <w:instrText>ADDIN BEC{Küppers and Kremer, 1978 #67857; Arnold and Manley, 1985 #57807; Gómez et al., 1996 #37909; Rodriguez et al., 2016 #101441}</w:instrText>
+      </w:r>
+      <w:r>
+        <w:rPr>
+          <w:rFonts w:ascii="Times New Roman" w:hAnsi="Times New Roman" w:cs="Times New Roman"/>
+        </w:rPr>
+        <w:fldChar w:fldCharType="separate"/>
+      </w:r>
+      <w:r>
+        <w:rPr>
+          <w:rFonts w:ascii="Times New Roman" w:hAnsi="Times New Roman" w:cs="Times New Roman"/>
+        </w:rPr>
+        <w:t>(Küppers &amp; Kremer 1978, Arnold &amp; Manley 1985, Gómez et al. 1996, Rodriguez et al. 2016)</w:t>
+      </w:r>
+      <w:r>
+        <w:rPr>
+          <w:rFonts w:ascii="Times New Roman" w:hAnsi="Times New Roman" w:cs="Times New Roman"/>
+        </w:rPr>
+        <w:fldChar w:fldCharType="end"/>
+      </w:r>
+      <w:r>
+        <w:rPr>
+          <w:rFonts w:ascii="Times New Roman" w:hAnsi="Times New Roman" w:cs="Times New Roman"/>
+        </w:rPr>
+        <w:t xml:space="preserve">. Ignorance of the physiology of experimental tissues on the one hand leads to the erroneous conclusion that decomposition rates derived from freshly excised seaweeds are representative of global carbon cycling (e.g. </w:t>
+      </w:r>
+      <w:r>
+        <w:rPr>
+          <w:rFonts w:ascii="Times New Roman" w:hAnsi="Times New Roman" w:cs="Times New Roman"/>
+        </w:rPr>
+        <w:fldChar w:fldCharType="begin"/>
+      </w:r>
+      <w:r>
+        <w:rPr>
+          <w:rFonts w:ascii="Times New Roman" w:hAnsi="Times New Roman" w:cs="Times New Roman"/>
+        </w:rPr>
+        <w:instrText>ADDIN BEC{Filbee-Dexter et al., 2024 #27978}</w:instrText>
+      </w:r>
+      <w:r>
+        <w:rPr>
+          <w:rFonts w:ascii="Times New Roman" w:hAnsi="Times New Roman" w:cs="Times New Roman"/>
+        </w:rPr>
+        <w:fldChar w:fldCharType="separate"/>
+      </w:r>
+      <w:r>
+        <w:rPr>
+          <w:rFonts w:ascii="Times New Roman" w:hAnsi="Times New Roman" w:cs="Times New Roman"/>
+        </w:rPr>
+        <w:t>Filbee-Dexter et al. 2024)</w:t>
+      </w:r>
+      <w:r>
+        <w:rPr>
+          <w:rFonts w:ascii="Times New Roman" w:hAnsi="Times New Roman" w:cs="Times New Roman"/>
+        </w:rPr>
+        <w:fldChar w:fldCharType="end"/>
+      </w:r>
+      <w:r>
+        <w:rPr>
+          <w:rFonts w:ascii="Times New Roman" w:hAnsi="Times New Roman" w:cs="Times New Roman"/>
+        </w:rPr>
+        <w:t xml:space="preserve">, and on the other hand results in practices that inadvertently impair photosynthesis to an unknown degree, such as long sample transport (e.g. </w:t>
+      </w:r>
+      <w:r>
+        <w:rPr>
+          <w:rFonts w:ascii="Times New Roman" w:hAnsi="Times New Roman" w:cs="Times New Roman"/>
+        </w:rPr>
+        <w:fldChar w:fldCharType="begin"/>
+      </w:r>
+      <w:r>
+        <w:rPr>
+          <w:rFonts w:ascii="Times New Roman" w:hAnsi="Times New Roman" w:cs="Times New Roman"/>
+        </w:rPr>
+        <w:instrText>ADDIN BEC{Pedersen et al., 2021 #86831}</w:instrText>
+      </w:r>
+      <w:r>
+        <w:rPr>
+          <w:rFonts w:ascii="Times New Roman" w:hAnsi="Times New Roman" w:cs="Times New Roman"/>
+        </w:rPr>
+        <w:fldChar w:fldCharType="separate"/>
+      </w:r>
+      <w:r>
+        <w:rPr>
+          <w:rFonts w:ascii="Times New Roman" w:hAnsi="Times New Roman" w:cs="Times New Roman"/>
+        </w:rPr>
+        <w:t>Pedersen et al. 2021)</w:t>
+      </w:r>
+      <w:r>
+        <w:rPr>
+          <w:rFonts w:ascii="Times New Roman" w:hAnsi="Times New Roman" w:cs="Times New Roman"/>
+        </w:rPr>
+        <w:fldChar w:fldCharType="end"/>
+      </w:r>
+      <w:r>
+        <w:rPr>
+          <w:rFonts w:ascii="Times New Roman" w:hAnsi="Times New Roman" w:cs="Times New Roman"/>
+        </w:rPr>
+        <w:t xml:space="preserve">. Secondly, conditions during a decomposition experiment </w:t>
+      </w:r>
+      <w:r>
+        <w:rPr>
+          <w:rFonts w:ascii="Times New Roman" w:hAnsi="Times New Roman" w:cs="Times New Roman"/>
+        </w:rPr>
+        <w:t>can</w:t>
+      </w:r>
+      <w:r>
+        <w:rPr>
+          <w:rFonts w:ascii="Times New Roman" w:hAnsi="Times New Roman" w:cs="Times New Roman"/>
+        </w:rPr>
+        <w:t xml:space="preserve"> have unintended effects on detrital photosynthesis which </w:t>
+      </w:r>
+      <w:r>
+        <w:rPr>
+          <w:rFonts w:ascii="Times New Roman" w:hAnsi="Times New Roman" w:cs="Times New Roman"/>
+        </w:rPr>
+        <w:t>may</w:t>
+      </w:r>
+      <w:r>
+        <w:rPr>
+          <w:rFonts w:ascii="Times New Roman" w:hAnsi="Times New Roman" w:cs="Times New Roman"/>
+        </w:rPr>
+        <w:t xml:space="preserve"> then be misattributed. As I have shown, detrital photosynthesis is highly sensitive to light in most plants </w:t>
+      </w:r>
+      <w:r>
+        <w:rPr>
+          <w:rFonts w:ascii="Times New Roman" w:hAnsi="Times New Roman" w:cs="Times New Roman"/>
+        </w:rPr>
+        <w:t xml:space="preserve">(Figure 2) </w:t>
+      </w:r>
+      <w:r>
+        <w:rPr>
+          <w:rFonts w:ascii="Times New Roman" w:hAnsi="Times New Roman" w:cs="Times New Roman"/>
+        </w:rPr>
+        <w:t xml:space="preserve">and temperature in kelps </w:t>
+      </w:r>
+      <w:r>
+        <w:rPr>
+          <w:rFonts w:ascii="Times New Roman" w:hAnsi="Times New Roman" w:cs="Times New Roman"/>
+        </w:rPr>
+        <w:fldChar w:fldCharType="begin"/>
+      </w:r>
+      <w:r>
+        <w:rPr>
+          <w:rFonts w:ascii="Times New Roman" w:hAnsi="Times New Roman" w:cs="Times New Roman"/>
+        </w:rPr>
+        <w:instrText>ADDIN BEC{Wright et al., 2024 #11375}</w:instrText>
+      </w:r>
+      <w:r>
+        <w:rPr>
+          <w:rFonts w:ascii="Times New Roman" w:hAnsi="Times New Roman" w:cs="Times New Roman"/>
+        </w:rPr>
+        <w:fldChar w:fldCharType="separate"/>
+      </w:r>
+      <w:r>
+        <w:rPr>
+          <w:rFonts w:ascii="Times New Roman" w:hAnsi="Times New Roman" w:cs="Times New Roman"/>
+        </w:rPr>
+        <w:t>(Wright et al. 2024)</w:t>
+      </w:r>
+      <w:r>
+        <w:rPr>
+          <w:rFonts w:ascii="Times New Roman" w:hAnsi="Times New Roman" w:cs="Times New Roman"/>
+        </w:rPr>
+        <w:fldChar w:fldCharType="end"/>
+      </w:r>
+      <w:r>
+        <w:rPr>
+          <w:rFonts w:ascii="Times New Roman" w:hAnsi="Times New Roman" w:cs="Times New Roman"/>
+        </w:rPr>
+        <w:t xml:space="preserve">. Oxygen is undoubtedly also important and there are probably many more nuanced physiological stressors that remain overlooked. For example, decomposition rates measured under any influence of even weak light will be highly misleading when the goal is to predict carbon cycling in the deep ocean </w:t>
+      </w:r>
+      <w:r>
+        <w:rPr>
+          <w:rFonts w:ascii="Times New Roman" w:hAnsi="Times New Roman" w:cs="Times New Roman"/>
+        </w:rPr>
+        <w:fldChar w:fldCharType="begin"/>
+      </w:r>
+      <w:r>
+        <w:rPr>
+          <w:rFonts w:ascii="Times New Roman" w:hAnsi="Times New Roman" w:cs="Times New Roman"/>
+        </w:rPr>
+        <w:instrText>ADDIN BEC{Filbee-Dexter et al., 2024 #27978; White and Norkko, 2025 #37663}</w:instrText>
+      </w:r>
+      <w:r>
+        <w:rPr>
+          <w:rFonts w:ascii="Times New Roman" w:hAnsi="Times New Roman" w:cs="Times New Roman"/>
+        </w:rPr>
+        <w:fldChar w:fldCharType="separate"/>
+      </w:r>
+      <w:r>
+        <w:rPr>
+          <w:rFonts w:ascii="Times New Roman" w:hAnsi="Times New Roman" w:cs="Times New Roman"/>
+        </w:rPr>
+        <w:t>(Filbee-Dexter et al. 2024, White &amp; Norkko 2025)</w:t>
+      </w:r>
+      <w:r>
+        <w:rPr>
+          <w:rFonts w:ascii="Times New Roman" w:hAnsi="Times New Roman" w:cs="Times New Roman"/>
+        </w:rPr>
+        <w:fldChar w:fldCharType="end"/>
+      </w:r>
+      <w:r>
+        <w:rPr>
+          <w:rFonts w:ascii="Times New Roman" w:hAnsi="Times New Roman" w:cs="Times New Roman"/>
+        </w:rPr>
+        <w:t>. Or the accelerating effect of temperature on decomposition</w:t>
+      </w:r>
+      <w:r>
+        <w:rPr>
+          <w:rFonts w:ascii="Times New Roman" w:hAnsi="Times New Roman" w:cs="Times New Roman"/>
+        </w:rPr>
+        <w:t xml:space="preserve"> </w:t>
+      </w:r>
+      <w:r>
+        <w:rPr>
+          <w:rFonts w:ascii="Times New Roman" w:hAnsi="Times New Roman" w:cs="Times New Roman"/>
+        </w:rPr>
+        <w:t xml:space="preserve">may be attributed to </w:t>
+      </w:r>
+      <w:r>
+        <w:rPr>
+          <w:rFonts w:ascii="Times New Roman" w:hAnsi="Times New Roman" w:cs="Times New Roman"/>
+        </w:rPr>
+        <w:t xml:space="preserve">structural weakening of detritus and </w:t>
+      </w:r>
+      <w:r>
+        <w:rPr>
+          <w:rFonts w:ascii="Times New Roman" w:hAnsi="Times New Roman" w:cs="Times New Roman"/>
+        </w:rPr>
+        <w:t xml:space="preserve">elevated microbial </w:t>
       </w:r>
       <w:r>
         <w:rPr>
           <w:rFonts w:ascii="Times New Roman" w:hAnsi="Times New Roman" w:cs="Times New Roman"/>
         </w:rPr>
         <w:lastRenderedPageBreak/>
-        <w:t>e</w:t>
-      </w:r>
-      <w:r>
-        <w:rPr>
-          <w:rFonts w:ascii="Times New Roman" w:hAnsi="Times New Roman" w:cs="Times New Roman"/>
-        </w:rPr>
-        <w:t xml:space="preserve">levated temperature may accelerate decomposition in three ways: by reducing the structural integrity of detritus, by increasing decomposer metabolism, and also by diminishing detrital photosynthesis as was recently demonstrated </w:t>
+        <w:t>metabolism</w:t>
+      </w:r>
+      <w:r>
+        <w:rPr>
+          <w:rFonts w:ascii="Times New Roman" w:hAnsi="Times New Roman" w:cs="Times New Roman"/>
+        </w:rPr>
+        <w:t xml:space="preserve"> rather than impaired detrital photosynthesis</w:t>
+      </w:r>
+      <w:r>
+        <w:rPr>
+          <w:rFonts w:ascii="Times New Roman" w:hAnsi="Times New Roman" w:cs="Times New Roman"/>
+        </w:rPr>
+        <w:t xml:space="preserve"> </w:t>
       </w:r>
       <w:r>
         <w:rPr>
@@ -13065,7 +13570,7 @@
         <w:rPr>
           <w:rFonts w:ascii="Times New Roman" w:hAnsi="Times New Roman" w:cs="Times New Roman"/>
         </w:rPr>
-        <w:instrText>ADDIN BEC{Wright et al., 2024 #11375}</w:instrText>
+        <w:instrText>ADDIN BEC{Filbee-Dexter et al., 2022 #89942; Frontier et al., 2022 #81381}</w:instrText>
       </w:r>
       <w:r>
         <w:rPr>
@@ -13077,540 +13582,7 @@
         <w:rPr>
           <w:rFonts w:ascii="Times New Roman" w:hAnsi="Times New Roman" w:cs="Times New Roman"/>
         </w:rPr>
-        <w:t>(Wright et al. 2024)</w:t>
-      </w:r>
-      <w:r>
-        <w:rPr>
-          <w:rFonts w:ascii="Times New Roman" w:hAnsi="Times New Roman" w:cs="Times New Roman"/>
-        </w:rPr>
-        <w:fldChar w:fldCharType="end"/>
-      </w:r>
-      <w:r>
-        <w:rPr>
-          <w:rFonts w:ascii="Times New Roman" w:hAnsi="Times New Roman" w:cs="Times New Roman"/>
-        </w:rPr>
-        <w:t>. Further research is required to tease apart these causal relationships.</w:t>
-      </w:r>
-    </w:p>
-    <w:p>
-      <w:pPr>
-        <w:spacing w:line="360" w:lineRule="auto"/>
-        <w:rPr>
-          <w:rFonts w:ascii="Times New Roman" w:hAnsi="Times New Roman" w:cs="Times New Roman"/>
-        </w:rPr>
-      </w:pPr>
-    </w:p>
-    <w:p>
-      <w:pPr>
-        <w:spacing w:line="360" w:lineRule="auto"/>
-        <w:rPr>
-          <w:rFonts w:ascii="Times New Roman" w:hAnsi="Times New Roman" w:cs="Times New Roman"/>
-        </w:rPr>
-      </w:pPr>
-      <w:r>
-        <w:rPr>
-          <w:rFonts w:ascii="Times New Roman" w:hAnsi="Times New Roman" w:cs="Times New Roman"/>
-        </w:rPr>
-        <w:t xml:space="preserve">Detrital photosynthesis should be considered when making inferences about </w:t>
-      </w:r>
-      <w:r>
-        <w:rPr>
-          <w:rFonts w:ascii="Times New Roman" w:hAnsi="Times New Roman" w:cs="Times New Roman"/>
-        </w:rPr>
-        <w:t>macroalgal</w:t>
-      </w:r>
-      <w:r>
-        <w:rPr>
-          <w:rFonts w:ascii="Times New Roman" w:hAnsi="Times New Roman" w:cs="Times New Roman"/>
-        </w:rPr>
-        <w:t xml:space="preserve"> decomposition. Firstly, the initial physiological state of detritus in a decomposition experiment may not reflect that in nature. In contrast to seagrass litter bag experiments </w:t>
-      </w:r>
-      <w:r>
-        <w:rPr>
-          <w:rFonts w:ascii="Times New Roman" w:hAnsi="Times New Roman" w:cs="Times New Roman"/>
-        </w:rPr>
-        <w:fldChar w:fldCharType="begin"/>
-      </w:r>
-      <w:r>
-        <w:rPr>
-          <w:rFonts w:ascii="Times New Roman" w:hAnsi="Times New Roman" w:cs="Times New Roman"/>
-        </w:rPr>
-        <w:instrText>ADDIN BEC{Harrison, 1989 #14810; Trevathan-Tackett et al., 2020 #39238}</w:instrText>
-      </w:r>
-      <w:r>
-        <w:rPr>
-          <w:rFonts w:ascii="Times New Roman" w:hAnsi="Times New Roman" w:cs="Times New Roman"/>
-        </w:rPr>
-        <w:fldChar w:fldCharType="separate"/>
-      </w:r>
-      <w:r>
-        <w:rPr>
-          <w:rFonts w:ascii="Times New Roman" w:hAnsi="Times New Roman" w:cs="Times New Roman"/>
-        </w:rPr>
-        <w:t>(Harrison 1989, Trevathan-Tackett et al. 2020)</w:t>
-      </w:r>
-      <w:r>
-        <w:rPr>
-          <w:rFonts w:ascii="Times New Roman" w:hAnsi="Times New Roman" w:cs="Times New Roman"/>
-        </w:rPr>
-        <w:fldChar w:fldCharType="end"/>
-      </w:r>
-      <w:r>
-        <w:rPr>
-          <w:rFonts w:ascii="Times New Roman" w:hAnsi="Times New Roman" w:cs="Times New Roman"/>
-        </w:rPr>
-        <w:t xml:space="preserve">, most seaweed decomposition experiments have </w:t>
-      </w:r>
-      <w:r>
-        <w:rPr>
-          <w:rFonts w:ascii="Times New Roman" w:hAnsi="Times New Roman" w:cs="Times New Roman"/>
-        </w:rPr>
-        <w:t xml:space="preserve">only </w:t>
-      </w:r>
-      <w:r>
-        <w:rPr>
-          <w:rFonts w:ascii="Times New Roman" w:hAnsi="Times New Roman" w:cs="Times New Roman"/>
-        </w:rPr>
-        <w:t xml:space="preserve">used freshly excised blades as a detritus proxy </w:t>
-      </w:r>
-      <w:r>
-        <w:rPr>
-          <w:rFonts w:ascii="Times New Roman" w:hAnsi="Times New Roman" w:cs="Times New Roman"/>
-        </w:rPr>
-        <w:fldChar w:fldCharType="begin"/>
-      </w:r>
-      <w:r>
-        <w:rPr>
-          <w:rFonts w:ascii="Times New Roman" w:hAnsi="Times New Roman" w:cs="Times New Roman"/>
-        </w:rPr>
-        <w:instrText>ADDIN BEC{Hamersley et al., 2015 #100188; de Bettignies et al., 2020 #27484}{Frontier et al., 2021 #5570; Frontier et al., 2022 #81381; Wright et al., 2022 #84779; Filbee-Dexter et al., 2022 #89942; Kennedy and Blain, 2025 #108523; White and Norkko, 2025 #37663}</w:instrText>
-      </w:r>
-      <w:r>
-        <w:rPr>
-          <w:rFonts w:ascii="Times New Roman" w:hAnsi="Times New Roman" w:cs="Times New Roman"/>
-        </w:rPr>
-        <w:fldChar w:fldCharType="separate"/>
-      </w:r>
-      <w:r>
-        <w:rPr>
-          <w:rFonts w:ascii="Times New Roman" w:hAnsi="Times New Roman" w:cs="Times New Roman"/>
-        </w:rPr>
-        <w:t>(Frontier et al. 2021, Filbee-Dexter et al. 2022, Frontier et al. 2022, Wright et al. 2022, Kennedy &amp; Blain 2025, White &amp; Norkko 2025)</w:t>
-      </w:r>
-      <w:r>
-        <w:rPr>
-          <w:rFonts w:ascii="Times New Roman" w:hAnsi="Times New Roman" w:cs="Times New Roman"/>
-        </w:rPr>
-        <w:fldChar w:fldCharType="end"/>
-      </w:r>
-      <w:r>
-        <w:rPr>
-          <w:rFonts w:ascii="Times New Roman" w:hAnsi="Times New Roman" w:cs="Times New Roman"/>
-        </w:rPr>
-        <w:t xml:space="preserve">. Senescent or naturally detached fronds are rarely included </w:t>
-      </w:r>
-      <w:r>
-        <w:rPr>
-          <w:rFonts w:ascii="Times New Roman" w:hAnsi="Times New Roman" w:cs="Times New Roman"/>
-        </w:rPr>
-        <w:fldChar w:fldCharType="begin"/>
-      </w:r>
-      <w:r>
-        <w:rPr>
-          <w:rFonts w:ascii="Times New Roman" w:hAnsi="Times New Roman" w:cs="Times New Roman"/>
-        </w:rPr>
-        <w:instrText>ADDIN BEC{Hamersley et al., 2015 #100188; de Bettignies et al., 2020 #27484}</w:instrText>
-      </w:r>
-      <w:r>
-        <w:rPr>
-          <w:rFonts w:ascii="Times New Roman" w:hAnsi="Times New Roman" w:cs="Times New Roman"/>
-        </w:rPr>
-        <w:fldChar w:fldCharType="separate"/>
-      </w:r>
-      <w:r>
-        <w:rPr>
-          <w:rFonts w:ascii="Times New Roman" w:hAnsi="Times New Roman" w:cs="Times New Roman"/>
-        </w:rPr>
-        <w:t>(Hamersley et al. 2015, de Bettignies et al. 2020)</w:t>
-      </w:r>
-      <w:r>
-        <w:rPr>
-          <w:rFonts w:ascii="Times New Roman" w:hAnsi="Times New Roman" w:cs="Times New Roman"/>
-        </w:rPr>
-        <w:fldChar w:fldCharType="end"/>
-      </w:r>
-      <w:r>
-        <w:rPr>
-          <w:rFonts w:ascii="Times New Roman" w:hAnsi="Times New Roman" w:cs="Times New Roman"/>
-        </w:rPr>
-        <w:t xml:space="preserve"> and the practice of pre-killing tissue to obtain detritus sensu stricto is </w:t>
-      </w:r>
-      <w:r>
-        <w:rPr>
-          <w:rFonts w:ascii="Times New Roman" w:hAnsi="Times New Roman" w:cs="Times New Roman"/>
-        </w:rPr>
-        <w:t>limited</w:t>
-      </w:r>
-      <w:r>
-        <w:rPr>
-          <w:rFonts w:ascii="Times New Roman" w:hAnsi="Times New Roman" w:cs="Times New Roman"/>
-        </w:rPr>
-        <w:t xml:space="preserve"> to few, mostly early studies </w:t>
-      </w:r>
-      <w:r>
-        <w:rPr>
-          <w:rFonts w:ascii="Times New Roman" w:hAnsi="Times New Roman" w:cs="Times New Roman"/>
-        </w:rPr>
-        <w:fldChar w:fldCharType="begin"/>
-      </w:r>
-      <w:r>
-        <w:rPr>
-          <w:rFonts w:ascii="Times New Roman" w:hAnsi="Times New Roman" w:cs="Times New Roman"/>
-        </w:rPr>
-        <w:instrText>ADDIN BEC{Josselyn and Mathieson, 1980 #46927; Rice and Tenore, 1981 #62280; Birch et al., 1983 #5321; Smith and Foreman, 1984 #41137; Brouwer, 1996 #26706}</w:instrText>
-      </w:r>
-      <w:r>
-        <w:rPr>
-          <w:rFonts w:ascii="Times New Roman" w:hAnsi="Times New Roman" w:cs="Times New Roman"/>
-        </w:rPr>
-        <w:fldChar w:fldCharType="separate"/>
-      </w:r>
-      <w:r>
-        <w:rPr>
-          <w:rFonts w:ascii="Times New Roman" w:hAnsi="Times New Roman" w:cs="Times New Roman"/>
-        </w:rPr>
-        <w:t>(Josselyn &amp; Mathieson 1980, Rice &amp; Tenore 1981, Birch et al. 1983, Smith &amp; Foreman 1984, Brouwer 1996)</w:t>
-      </w:r>
-      <w:r>
-        <w:rPr>
-          <w:rFonts w:ascii="Times New Roman" w:hAnsi="Times New Roman" w:cs="Times New Roman"/>
-        </w:rPr>
-        <w:fldChar w:fldCharType="end"/>
-      </w:r>
-      <w:r>
-        <w:rPr>
-          <w:rFonts w:ascii="Times New Roman" w:hAnsi="Times New Roman" w:cs="Times New Roman"/>
-        </w:rPr>
-        <w:t xml:space="preserve">. While the fraction of seaweed detritus that consists of whole dislodged plants or fronds is certainly initially viable, the majority of tissue that is abscised or eroded likely </w:t>
-      </w:r>
-      <w:r>
-        <w:rPr>
-          <w:rFonts w:ascii="Times New Roman" w:hAnsi="Times New Roman" w:cs="Times New Roman"/>
-        </w:rPr>
-        <w:t xml:space="preserve">already </w:t>
-      </w:r>
-      <w:r>
-        <w:rPr>
-          <w:rFonts w:ascii="Times New Roman" w:hAnsi="Times New Roman" w:cs="Times New Roman"/>
-        </w:rPr>
-        <w:t xml:space="preserve">exhibits impaired photosynthesis </w:t>
-      </w:r>
-      <w:r>
-        <w:rPr>
-          <w:rFonts w:ascii="Times New Roman" w:hAnsi="Times New Roman" w:cs="Times New Roman"/>
-        </w:rPr>
-        <w:t>before</w:t>
-      </w:r>
-      <w:r>
-        <w:rPr>
-          <w:rFonts w:ascii="Times New Roman" w:hAnsi="Times New Roman" w:cs="Times New Roman"/>
-        </w:rPr>
-        <w:t xml:space="preserve"> detachment</w:t>
-      </w:r>
-      <w:r>
-        <w:rPr>
-          <w:rFonts w:ascii="Times New Roman" w:hAnsi="Times New Roman" w:cs="Times New Roman"/>
-        </w:rPr>
-        <w:t xml:space="preserve"> </w:t>
-      </w:r>
-      <w:r>
-        <w:rPr>
-          <w:rFonts w:ascii="Times New Roman" w:hAnsi="Times New Roman" w:cs="Times New Roman"/>
-        </w:rPr>
-        <w:fldChar w:fldCharType="begin"/>
-      </w:r>
-      <w:r>
-        <w:rPr>
-          <w:rFonts w:ascii="Times New Roman" w:hAnsi="Times New Roman" w:cs="Times New Roman"/>
-        </w:rPr>
-        <w:instrText>ADDIN BEC{Küppers and Kremer, 1978 #67857; Arnold and Manley, 1985 #57807; Gómez et al., 1996 #37909; Rodriguez et al., 2016 #101441}</w:instrText>
-      </w:r>
-      <w:r>
-        <w:rPr>
-          <w:rFonts w:ascii="Times New Roman" w:hAnsi="Times New Roman" w:cs="Times New Roman"/>
-        </w:rPr>
-        <w:fldChar w:fldCharType="separate"/>
-      </w:r>
-      <w:r>
-        <w:rPr>
-          <w:rFonts w:ascii="Times New Roman" w:hAnsi="Times New Roman" w:cs="Times New Roman"/>
-        </w:rPr>
-        <w:t>(Küppers &amp; Kremer 1978, Arnold &amp; Manley 1985, Gómez et al. 1996, Rodriguez et al. 2016)</w:t>
-      </w:r>
-      <w:r>
-        <w:rPr>
-          <w:rFonts w:ascii="Times New Roman" w:hAnsi="Times New Roman" w:cs="Times New Roman"/>
-        </w:rPr>
-        <w:fldChar w:fldCharType="end"/>
-      </w:r>
-      <w:r>
-        <w:rPr>
-          <w:rFonts w:ascii="Times New Roman" w:hAnsi="Times New Roman" w:cs="Times New Roman"/>
-        </w:rPr>
-        <w:t xml:space="preserve">. Ignorance of the physiology of experimental tissues on the one hand leads to the erroneous conclusion that decomposition rates derived from freshly excised seaweeds are representative of global carbon cycling (e.g. </w:t>
-      </w:r>
-      <w:r>
-        <w:rPr>
-          <w:rFonts w:ascii="Times New Roman" w:hAnsi="Times New Roman" w:cs="Times New Roman"/>
-        </w:rPr>
-        <w:fldChar w:fldCharType="begin"/>
-      </w:r>
-      <w:r>
-        <w:rPr>
-          <w:rFonts w:ascii="Times New Roman" w:hAnsi="Times New Roman" w:cs="Times New Roman"/>
-        </w:rPr>
-        <w:instrText>ADDIN BEC{Filbee-Dexter et al., 2024 #27978}</w:instrText>
-      </w:r>
-      <w:r>
-        <w:rPr>
-          <w:rFonts w:ascii="Times New Roman" w:hAnsi="Times New Roman" w:cs="Times New Roman"/>
-        </w:rPr>
-        <w:fldChar w:fldCharType="separate"/>
-      </w:r>
-      <w:r>
-        <w:rPr>
-          <w:rFonts w:ascii="Times New Roman" w:hAnsi="Times New Roman" w:cs="Times New Roman"/>
-        </w:rPr>
-        <w:t>Filbee-Dexter et al. 2024)</w:t>
-      </w:r>
-      <w:r>
-        <w:rPr>
-          <w:rFonts w:ascii="Times New Roman" w:hAnsi="Times New Roman" w:cs="Times New Roman"/>
-        </w:rPr>
-        <w:fldChar w:fldCharType="end"/>
-      </w:r>
-      <w:r>
-        <w:rPr>
-          <w:rFonts w:ascii="Times New Roman" w:hAnsi="Times New Roman" w:cs="Times New Roman"/>
-        </w:rPr>
-        <w:t xml:space="preserve">, and on the other hand results in practices that inadvertently impair photosynthesis to an unknown degree, such as long sample transport (e.g. </w:t>
-      </w:r>
-      <w:r>
-        <w:rPr>
-          <w:rFonts w:ascii="Times New Roman" w:hAnsi="Times New Roman" w:cs="Times New Roman"/>
-        </w:rPr>
-        <w:fldChar w:fldCharType="begin"/>
-      </w:r>
-      <w:r>
-        <w:rPr>
-          <w:rFonts w:ascii="Times New Roman" w:hAnsi="Times New Roman" w:cs="Times New Roman"/>
-        </w:rPr>
-        <w:instrText>ADDIN BEC{Pedersen et al., 2021 #86831}</w:instrText>
-      </w:r>
-      <w:r>
-        <w:rPr>
-          <w:rFonts w:ascii="Times New Roman" w:hAnsi="Times New Roman" w:cs="Times New Roman"/>
-        </w:rPr>
-        <w:fldChar w:fldCharType="separate"/>
-      </w:r>
-      <w:r>
-        <w:rPr>
-          <w:rFonts w:ascii="Times New Roman" w:hAnsi="Times New Roman" w:cs="Times New Roman"/>
-        </w:rPr>
-        <w:t>Pedersen et al. 2021)</w:t>
-      </w:r>
-      <w:r>
-        <w:rPr>
-          <w:rFonts w:ascii="Times New Roman" w:hAnsi="Times New Roman" w:cs="Times New Roman"/>
-        </w:rPr>
-        <w:fldChar w:fldCharType="end"/>
-      </w:r>
-      <w:r>
-        <w:rPr>
-          <w:rFonts w:ascii="Times New Roman" w:hAnsi="Times New Roman" w:cs="Times New Roman"/>
-        </w:rPr>
-        <w:t xml:space="preserve">. Secondly, conditions during a decomposition experiment </w:t>
-      </w:r>
-      <w:r>
-        <w:rPr>
-          <w:rFonts w:ascii="Times New Roman" w:hAnsi="Times New Roman" w:cs="Times New Roman"/>
-        </w:rPr>
-        <w:t>can</w:t>
-      </w:r>
-      <w:r>
-        <w:rPr>
-          <w:rFonts w:ascii="Times New Roman" w:hAnsi="Times New Roman" w:cs="Times New Roman"/>
-        </w:rPr>
-        <w:t xml:space="preserve"> have unintended effects on detrital photosynthesis which </w:t>
-      </w:r>
-      <w:r>
-        <w:rPr>
-          <w:rFonts w:ascii="Times New Roman" w:hAnsi="Times New Roman" w:cs="Times New Roman"/>
-        </w:rPr>
-        <w:t>may</w:t>
-      </w:r>
-      <w:r>
-        <w:rPr>
-          <w:rFonts w:ascii="Times New Roman" w:hAnsi="Times New Roman" w:cs="Times New Roman"/>
-        </w:rPr>
-        <w:t xml:space="preserve"> then be misattributed. As I have shown, detrital photosynthesis is highly sensitive to light in most plants </w:t>
-      </w:r>
-      <w:r>
-        <w:rPr>
-          <w:rFonts w:ascii="Times New Roman" w:hAnsi="Times New Roman" w:cs="Times New Roman"/>
-        </w:rPr>
-        <w:t xml:space="preserve">(Figure 2) </w:t>
-      </w:r>
-      <w:r>
-        <w:rPr>
-          <w:rFonts w:ascii="Times New Roman" w:hAnsi="Times New Roman" w:cs="Times New Roman"/>
-        </w:rPr>
-        <w:t xml:space="preserve">and temperature in kelps </w:t>
-      </w:r>
-      <w:r>
-        <w:rPr>
-          <w:rFonts w:ascii="Times New Roman" w:hAnsi="Times New Roman" w:cs="Times New Roman"/>
-        </w:rPr>
-        <w:fldChar w:fldCharType="begin"/>
-      </w:r>
-      <w:r>
-        <w:rPr>
-          <w:rFonts w:ascii="Times New Roman" w:hAnsi="Times New Roman" w:cs="Times New Roman"/>
-        </w:rPr>
-        <w:instrText>ADDIN BEC{Wright et al., 2024 #11375}</w:instrText>
-      </w:r>
-      <w:r>
-        <w:rPr>
-          <w:rFonts w:ascii="Times New Roman" w:hAnsi="Times New Roman" w:cs="Times New Roman"/>
-        </w:rPr>
-        <w:fldChar w:fldCharType="separate"/>
-      </w:r>
-      <w:r>
-        <w:rPr>
-          <w:rFonts w:ascii="Times New Roman" w:hAnsi="Times New Roman" w:cs="Times New Roman"/>
-        </w:rPr>
-        <w:t>(Wright et al. 2024)</w:t>
-      </w:r>
-      <w:r>
-        <w:rPr>
-          <w:rFonts w:ascii="Times New Roman" w:hAnsi="Times New Roman" w:cs="Times New Roman"/>
-        </w:rPr>
-        <w:fldChar w:fldCharType="end"/>
-      </w:r>
-      <w:r>
-        <w:rPr>
-          <w:rFonts w:ascii="Times New Roman" w:hAnsi="Times New Roman" w:cs="Times New Roman"/>
-        </w:rPr>
-        <w:t xml:space="preserve">. Oxygen is undoubtedly also important and there are probably many more nuanced physiological stressors that remain overlooked. For example, decomposition rates measured under any influence of even weak light will be highly misleading when the goal is to predict carbon cycling in the deep ocean </w:t>
-      </w:r>
-      <w:r>
-        <w:rPr>
-          <w:rFonts w:ascii="Times New Roman" w:hAnsi="Times New Roman" w:cs="Times New Roman"/>
-        </w:rPr>
-        <w:fldChar w:fldCharType="begin"/>
-      </w:r>
-      <w:r>
-        <w:rPr>
-          <w:rFonts w:ascii="Times New Roman" w:hAnsi="Times New Roman" w:cs="Times New Roman"/>
-        </w:rPr>
-        <w:instrText>ADDIN BEC{Filbee-Dexter et al., 2024 #27978; White and Norkko, 2025 #37663}</w:instrText>
-      </w:r>
-      <w:r>
-        <w:rPr>
-          <w:rFonts w:ascii="Times New Roman" w:hAnsi="Times New Roman" w:cs="Times New Roman"/>
-        </w:rPr>
-        <w:fldChar w:fldCharType="separate"/>
-      </w:r>
-      <w:r>
-        <w:rPr>
-          <w:rFonts w:ascii="Times New Roman" w:hAnsi="Times New Roman" w:cs="Times New Roman"/>
-        </w:rPr>
-        <w:t>(Filbee-Dexter et al. 2024, White &amp; Norkko 2025)</w:t>
-      </w:r>
-      <w:r>
-        <w:rPr>
-          <w:rFonts w:ascii="Times New Roman" w:hAnsi="Times New Roman" w:cs="Times New Roman"/>
-        </w:rPr>
-        <w:fldChar w:fldCharType="end"/>
-      </w:r>
-      <w:r>
-        <w:rPr>
-          <w:rFonts w:ascii="Times New Roman" w:hAnsi="Times New Roman" w:cs="Times New Roman"/>
-        </w:rPr>
-        <w:t>. Or the accelerating effect of temperature on decomposition</w:t>
-      </w:r>
-      <w:r>
-        <w:rPr>
-          <w:rFonts w:ascii="Times New Roman" w:hAnsi="Times New Roman" w:cs="Times New Roman"/>
-        </w:rPr>
-        <w:t xml:space="preserve"> </w:t>
-      </w:r>
-      <w:r>
-        <w:rPr>
-          <w:rFonts w:ascii="Times New Roman" w:hAnsi="Times New Roman" w:cs="Times New Roman"/>
-        </w:rPr>
-        <w:t xml:space="preserve">may be attributed to </w:t>
-      </w:r>
-      <w:r>
-        <w:rPr>
-          <w:rFonts w:ascii="Times New Roman" w:hAnsi="Times New Roman" w:cs="Times New Roman"/>
-        </w:rPr>
-        <w:t xml:space="preserve">structural weakening of detritus and </w:t>
-      </w:r>
-      <w:r>
-        <w:rPr>
-          <w:rFonts w:ascii="Times New Roman" w:hAnsi="Times New Roman" w:cs="Times New Roman"/>
-        </w:rPr>
-        <w:t xml:space="preserve">elevated microbial </w:t>
-      </w:r>
-      <w:r>
-        <w:rPr>
-          <w:rFonts w:ascii="Times New Roman" w:hAnsi="Times New Roman" w:cs="Times New Roman"/>
-        </w:rPr>
-        <w:t>metabolism</w:t>
-      </w:r>
-      <w:r>
-        <w:rPr>
-          <w:rFonts w:ascii="Times New Roman" w:hAnsi="Times New Roman" w:cs="Times New Roman"/>
-        </w:rPr>
-        <w:t xml:space="preserve"> rather than impaired detrital photosynthesis</w:t>
-      </w:r>
-      <w:r>
-        <w:rPr>
-          <w:rFonts w:ascii="Times New Roman" w:hAnsi="Times New Roman" w:cs="Times New Roman"/>
-        </w:rPr>
-        <w:t xml:space="preserve"> </w:t>
-      </w:r>
-      <w:r>
-        <w:rPr>
-          <w:rFonts w:ascii="Times New Roman" w:hAnsi="Times New Roman" w:cs="Times New Roman"/>
-        </w:rPr>
-        <w:fldChar w:fldCharType="begin"/>
-      </w:r>
-      <w:r>
-        <w:rPr>
-          <w:rFonts w:ascii="Times New Roman" w:hAnsi="Times New Roman" w:cs="Times New Roman"/>
-        </w:rPr>
-        <w:instrText>ADDIN BEC{Filbee-Dexter et al., 2022 #89942; Frontier et al., 2022 #81381}</w:instrText>
-      </w:r>
-      <w:r>
-        <w:rPr>
-          <w:rFonts w:ascii="Times New Roman" w:hAnsi="Times New Roman" w:cs="Times New Roman"/>
-        </w:rPr>
-        <w:fldChar w:fldCharType="separate"/>
-      </w:r>
-      <w:r>
-        <w:rPr>
-          <w:rFonts w:ascii="Times New Roman" w:hAnsi="Times New Roman" w:cs="Times New Roman"/>
-        </w:rPr>
-        <w:t xml:space="preserve">(Filbee-Dexter et al. 2022, Frontier et al. </w:t>
-      </w:r>
-      <w:r>
-        <w:rPr>
-          <w:rFonts w:ascii="Times New Roman" w:hAnsi="Times New Roman" w:cs="Times New Roman"/>
-        </w:rPr>
-        <w:lastRenderedPageBreak/>
-        <w:t>2022)</w:t>
+        <w:t>(Filbee-Dexter et al. 2022, Frontier et al. 2022)</w:t>
       </w:r>
       <w:r>
         <w:rPr>
@@ -14010,7 +13982,14 @@
         <w:rPr>
           <w:rFonts w:ascii="Times New Roman" w:hAnsi="Times New Roman" w:cs="Times New Roman"/>
         </w:rPr>
-        <w:t xml:space="preserve"> and joining me in the field, Yannick Mulders and Thomas Wernberg for supplying and </w:t>
+        <w:t xml:space="preserve"> and joining me in the field, Yannick Mulders and </w:t>
+      </w:r>
+      <w:r>
+        <w:rPr>
+          <w:rFonts w:ascii="Times New Roman" w:hAnsi="Times New Roman" w:cs="Times New Roman"/>
+        </w:rPr>
+        <w:lastRenderedPageBreak/>
+        <w:t xml:space="preserve">Thomas Wernberg for supplying and </w:t>
       </w:r>
       <w:proofErr w:type="spellStart"/>
       <w:r>
@@ -14495,58 +14474,16 @@
           <w:rFonts w:ascii="Times New Roman" w:hAnsi="Times New Roman" w:cs="Times New Roman"/>
           <w:kern w:val="0"/>
         </w:rPr>
-        <w:t xml:space="preserve">de </w:t>
-      </w:r>
-      <w:proofErr w:type="spellStart"/>
-      <w:r>
-        <w:rPr>
-          <w:rFonts w:ascii="Times New Roman" w:hAnsi="Times New Roman" w:cs="Times New Roman"/>
-          <w:kern w:val="0"/>
-        </w:rPr>
-        <w:t>Bettignies</w:t>
-      </w:r>
-      <w:proofErr w:type="spellEnd"/>
-      <w:r>
-        <w:rPr>
-          <w:rFonts w:ascii="Times New Roman" w:hAnsi="Times New Roman" w:cs="Times New Roman"/>
-          <w:kern w:val="0"/>
-        </w:rPr>
-        <w:t xml:space="preserve"> F, Dauby P, Thomas F, Gobet A, Delage L, Bohner O, Loisel S, </w:t>
-      </w:r>
-      <w:proofErr w:type="spellStart"/>
-      <w:r>
-        <w:rPr>
-          <w:rFonts w:ascii="Times New Roman" w:hAnsi="Times New Roman" w:cs="Times New Roman"/>
-          <w:kern w:val="0"/>
-        </w:rPr>
-        <w:t>Davoult</w:t>
-      </w:r>
-      <w:proofErr w:type="spellEnd"/>
-      <w:r>
-        <w:rPr>
-          <w:rFonts w:ascii="Times New Roman" w:hAnsi="Times New Roman" w:cs="Times New Roman"/>
-          <w:kern w:val="0"/>
-        </w:rPr>
-        <w:t xml:space="preserve"> D (2020) Degradation dynamics and processes associated with the accumulation of </w:t>
-      </w:r>
-      <w:r>
-        <w:rPr>
-          <w:rFonts w:ascii="Times New Roman" w:hAnsi="Times New Roman" w:cs="Times New Roman"/>
-          <w:i/>
-          <w:kern w:val="0"/>
-        </w:rPr>
-        <w:t xml:space="preserve">Laminaria </w:t>
-      </w:r>
-      <w:proofErr w:type="spellStart"/>
-      <w:r>
-        <w:rPr>
-          <w:rFonts w:ascii="Times New Roman" w:hAnsi="Times New Roman" w:cs="Times New Roman"/>
-          <w:i/>
-          <w:kern w:val="0"/>
-        </w:rPr>
-        <w:t>hyperborea</w:t>
-      </w:r>
-      <w:proofErr w:type="spellEnd"/>
+        <w:t xml:space="preserve">de Bettignies F, Dauby P, Thomas F, Gobet A, Delage L, Bohner O, Loisel S, Davoult D (2020) Degradation dynamics and processes associated with the accumulation of </w:t>
+      </w:r>
+      <w:r>
+        <w:rPr>
+          <w:rFonts w:ascii="Times New Roman" w:hAnsi="Times New Roman" w:cs="Times New Roman"/>
+          <w:i/>
+          <w:kern w:val="0"/>
+        </w:rPr>
+        <w:t>Laminaria hyperborea</w:t>
+      </w:r>
       <w:r>
         <w:rPr>
           <w:rFonts w:ascii="Times New Roman" w:hAnsi="Times New Roman" w:cs="Times New Roman"/>
@@ -14587,6 +14524,7 @@
           <w:rFonts w:ascii="Times New Roman" w:hAnsi="Times New Roman" w:cs="Times New Roman"/>
           <w:kern w:val="0"/>
         </w:rPr>
+        <w:lastRenderedPageBreak/>
         <w:t xml:space="preserve">Birch PB, Gabrielson JO, Hamel KS (1983) Decomposition of </w:t>
       </w:r>
       <w:r>
@@ -14637,7 +14575,6 @@
           <w:rFonts w:ascii="Times New Roman" w:hAnsi="Times New Roman" w:cs="Times New Roman"/>
           <w:kern w:val="0"/>
         </w:rPr>
-        <w:lastRenderedPageBreak/>
         <w:t xml:space="preserve">Bolton JJ (2016) What is aquatic botany? — and why algae are plants: the importance of non-taxonomic terms for groups of organisms. </w:t>
       </w:r>
       <w:r>
@@ -15033,7 +14970,15 @@
           <w:rFonts w:ascii="Times New Roman" w:hAnsi="Times New Roman" w:cs="Times New Roman"/>
           <w:kern w:val="0"/>
         </w:rPr>
-        <w:t xml:space="preserve">Filbee-Dexter K, Feehan CJ, Smale DA, Krumhansl KA, Augustine S, de Bettignies F, Burrows MT, Byrnes JEK, Campbell J, Davoult D et al. (2022) Kelp carbon sink potential decreases with warming due to accelerating decomposition. </w:t>
+        <w:t xml:space="preserve">Filbee-Dexter K, Feehan CJ, Smale DA, Krumhansl KA, Augustine S, de Bettignies F, Burrows MT, Byrnes JEK, Campbell J, Davoult D et al. (2022) Kelp carbon sink potential decreases </w:t>
+      </w:r>
+      <w:r>
+        <w:rPr>
+          <w:rFonts w:ascii="Times New Roman" w:hAnsi="Times New Roman" w:cs="Times New Roman"/>
+          <w:kern w:val="0"/>
+        </w:rPr>
+        <w:lastRenderedPageBreak/>
+        <w:t xml:space="preserve">with warming due to accelerating decomposition. </w:t>
       </w:r>
       <w:r>
         <w:rPr>
@@ -15068,7 +15013,6 @@
           <w:rFonts w:ascii="Times New Roman" w:hAnsi="Times New Roman" w:cs="Times New Roman"/>
           <w:kern w:val="0"/>
         </w:rPr>
-        <w:lastRenderedPageBreak/>
         <w:t xml:space="preserve">Filbee-Dexter K, Pessarrodona A, Pedersen MF, Wernberg T, Duarte CM, Assis J, Bekkby T, Burrows MT, Carlson DF, Gattuso J-P (2024) Carbon export from seaweed forests to deep ocean sinks. </w:t>
       </w:r>
       <w:r>
@@ -15354,6 +15298,7 @@
           <w:rFonts w:ascii="Times New Roman" w:hAnsi="Times New Roman" w:cs="Times New Roman"/>
           <w:kern w:val="0"/>
         </w:rPr>
+        <w:lastRenderedPageBreak/>
         <w:t xml:space="preserve">Gómez I, Wiencke C, Thomas DN (1996) Variations in photosynthetic characteristics of the Antarctic marine brown alga </w:t>
       </w:r>
       <w:r>
@@ -15404,7 +15349,6 @@
           <w:rFonts w:ascii="Times New Roman" w:hAnsi="Times New Roman" w:cs="Times New Roman"/>
           <w:kern w:val="0"/>
         </w:rPr>
-        <w:lastRenderedPageBreak/>
         <w:t xml:space="preserve">Graiff A, Karsten U, Meyer S, Pfender D, Tala F, Thiel M (2013) Seasonal variation in floating persistence of detached </w:t>
       </w:r>
       <w:r>
@@ -15810,6 +15754,7 @@
           <w:rFonts w:ascii="Times New Roman" w:hAnsi="Times New Roman" w:cs="Times New Roman"/>
           <w:kern w:val="0"/>
         </w:rPr>
+        <w:lastRenderedPageBreak/>
         <w:t xml:space="preserve">Hemminga MA, Marba N, Stapel J (1999) Leaf nutrient resorption, leaf lifespan and the retention of nutrients in seagrass systems. </w:t>
       </w:r>
       <w:r>
@@ -15845,7 +15790,6 @@
           <w:rFonts w:ascii="Times New Roman" w:hAnsi="Times New Roman" w:cs="Times New Roman"/>
           <w:kern w:val="0"/>
         </w:rPr>
-        <w:lastRenderedPageBreak/>
         <w:t xml:space="preserve">Hernández‐Carmona G, Hughes B, Graham MH (2006) Reproductive longevity of drifting kelp </w:t>
       </w:r>
       <w:r>
@@ -16206,6 +16150,7 @@
           <w:rFonts w:ascii="Times New Roman" w:hAnsi="Times New Roman" w:cs="Times New Roman"/>
           <w:kern w:val="0"/>
         </w:rPr>
+        <w:lastRenderedPageBreak/>
         <w:t xml:space="preserve">Kennedy JR, Blain CO (2025) A systematic review of marine macroalgal degradation: toward a better understanding of macroalgal carbon sequestration potential. </w:t>
       </w:r>
       <w:r>
@@ -16241,7 +16186,6 @@
           <w:rFonts w:ascii="Times New Roman" w:hAnsi="Times New Roman" w:cs="Times New Roman"/>
           <w:kern w:val="0"/>
         </w:rPr>
-        <w:lastRenderedPageBreak/>
         <w:t xml:space="preserve">Kenworthy WJ, Currin CA, Fonseca MS, Smith G (1989) Production, decomposition, and heterotrophic utilization of the seagrass </w:t>
       </w:r>
       <w:r>
@@ -16662,15 +16606,8 @@
           <w:rFonts w:ascii="Times New Roman" w:hAnsi="Times New Roman" w:cs="Times New Roman"/>
           <w:kern w:val="0"/>
         </w:rPr>
-        <w:t xml:space="preserve">Macaya EC, Boltana S, Hinojosa IA, Macchiavello JE, Valdivia NA, Vasquez NR, Buschmann AH, Vasquez JA, Alonso Vega JM, Thiel M (2005) Presence of sporophylls in floating </w:t>
-      </w:r>
-      <w:r>
-        <w:rPr>
-          <w:rFonts w:ascii="Times New Roman" w:hAnsi="Times New Roman" w:cs="Times New Roman"/>
-          <w:kern w:val="0"/>
-        </w:rPr>
         <w:lastRenderedPageBreak/>
-        <w:t xml:space="preserve">kelp rafts of </w:t>
+        <w:t xml:space="preserve">Macaya EC, Boltana S, Hinojosa IA, Macchiavello JE, Valdivia NA, Vasquez NR, Buschmann AH, Vasquez JA, Alonso Vega JM, Thiel M (2005) Presence of sporophylls in floating kelp rafts of </w:t>
       </w:r>
       <w:r>
         <w:rPr>
@@ -17085,6 +17022,7 @@
           <w:rFonts w:ascii="Times New Roman" w:hAnsi="Times New Roman" w:cs="Times New Roman"/>
           <w:kern w:val="0"/>
         </w:rPr>
+        <w:lastRenderedPageBreak/>
         <w:t xml:space="preserve">Olson JS (1963) Energy storage and the balance of producers and decomposers in ecological systems. </w:t>
       </w:r>
       <w:r>
@@ -17120,7 +17058,6 @@
           <w:rFonts w:ascii="Times New Roman" w:hAnsi="Times New Roman" w:cs="Times New Roman"/>
           <w:kern w:val="0"/>
         </w:rPr>
-        <w:lastRenderedPageBreak/>
         <w:t xml:space="preserve">Patriquin D, Knowles R (1972) Nitrogen fixation in the rhizosphere of marine angiosperms. </w:t>
       </w:r>
       <w:r>
@@ -17526,6 +17463,7 @@
           <w:rFonts w:ascii="Times New Roman" w:hAnsi="Times New Roman" w:cs="Times New Roman"/>
           <w:kern w:val="0"/>
         </w:rPr>
+        <w:lastRenderedPageBreak/>
         <w:t>Rosch KL, Koch MS (2009) Nitrogen and phosphorus recycling by a dominant tropical seagrass (</w:t>
       </w:r>
       <w:r>
@@ -17556,15 +17494,7 @@
           <w:rFonts w:ascii="Times New Roman" w:hAnsi="Times New Roman" w:cs="Times New Roman"/>
           <w:kern w:val="0"/>
         </w:rPr>
-        <w:t xml:space="preserve"> 84, 1–24. </w:t>
-      </w:r>
-      <w:r>
-        <w:rPr>
-          <w:rFonts w:ascii="Times New Roman" w:hAnsi="Times New Roman" w:cs="Times New Roman"/>
-          <w:kern w:val="0"/>
-        </w:rPr>
-        <w:lastRenderedPageBreak/>
-        <w:t>https://www.ingentaconnect.com/contentone/umrsmas/bullmar/2009/00000084/00000001/art00001.</w:t>
+        <w:t xml:space="preserve"> 84, 1–24. https://www.ingentaconnect.com/contentone/umrsmas/bullmar/2009/00000084/00000001/art00001.</w:t>
       </w:r>
     </w:p>
     <w:p>
@@ -17769,23 +17699,7 @@
           <w:rFonts w:ascii="Times New Roman" w:hAnsi="Times New Roman" w:cs="Times New Roman"/>
           <w:kern w:val="0"/>
         </w:rPr>
-        <w:t xml:space="preserve">de </w:t>
-      </w:r>
-      <w:proofErr w:type="spellStart"/>
-      <w:r>
-        <w:rPr>
-          <w:rFonts w:ascii="Times New Roman" w:hAnsi="Times New Roman" w:cs="Times New Roman"/>
-          <w:kern w:val="0"/>
-        </w:rPr>
-        <w:t>los</w:t>
-      </w:r>
-      <w:proofErr w:type="spellEnd"/>
-      <w:r>
-        <w:rPr>
-          <w:rFonts w:ascii="Times New Roman" w:hAnsi="Times New Roman" w:cs="Times New Roman"/>
-          <w:kern w:val="0"/>
-        </w:rPr>
-        <w:t xml:space="preserve"> Santos CB, Onoda Y, Vergara JJ, Pérez-Lloréns JL, Bouma TJ, La Nafie YA, Cambridge ML, Brun FG (2016) A comprehensive analysis of mechanical and morphological traits in temperate and tropical seagrass species. </w:t>
+        <w:t xml:space="preserve">de los Santos CB, Onoda Y, Vergara JJ, Pérez-Lloréns JL, Bouma TJ, La Nafie YA, Cambridge ML, Brun FG (2016) A comprehensive analysis of mechanical and morphological traits in temperate and tropical seagrass species. </w:t>
       </w:r>
       <w:r>
         <w:rPr>
@@ -17820,23 +17734,7 @@
           <w:rFonts w:ascii="Times New Roman" w:hAnsi="Times New Roman" w:cs="Times New Roman"/>
           <w:kern w:val="0"/>
         </w:rPr>
-        <w:t xml:space="preserve">de </w:t>
-      </w:r>
-      <w:proofErr w:type="spellStart"/>
-      <w:r>
-        <w:rPr>
-          <w:rFonts w:ascii="Times New Roman" w:hAnsi="Times New Roman" w:cs="Times New Roman"/>
-          <w:kern w:val="0"/>
-        </w:rPr>
-        <w:t>los</w:t>
-      </w:r>
-      <w:proofErr w:type="spellEnd"/>
-      <w:r>
-        <w:rPr>
-          <w:rFonts w:ascii="Times New Roman" w:hAnsi="Times New Roman" w:cs="Times New Roman"/>
-          <w:kern w:val="0"/>
-        </w:rPr>
-        <w:t xml:space="preserve"> Santos CB, Brun FG, Onoda Y, Cambridge ML, Bouma TJ, Vergara JJ, Pérez-Lloréns JL (2012) Leaf-fracture properties correlated with nutritional traits in nine Australian seagrass species: implications for susceptibility to herbivory. </w:t>
+        <w:t xml:space="preserve">de los Santos CB, Brun FG, Onoda Y, Cambridge ML, Bouma TJ, Vergara JJ, Pérez-Lloréns JL (2012) Leaf-fracture properties correlated with nutritional traits in nine Australian seagrass species: implications for susceptibility to herbivory. </w:t>
       </w:r>
       <w:r>
         <w:rPr>
@@ -17921,6 +17819,7 @@
           <w:rFonts w:ascii="Times New Roman" w:hAnsi="Times New Roman" w:cs="Times New Roman"/>
           <w:kern w:val="0"/>
         </w:rPr>
+        <w:lastRenderedPageBreak/>
         <w:t xml:space="preserve">Smith BD, Foreman RE (1984) An assessment of seaweed decomposition within a southern Strait of Georgia seaweed community. </w:t>
       </w:r>
       <w:r>
@@ -17956,7 +17855,6 @@
           <w:rFonts w:ascii="Times New Roman" w:hAnsi="Times New Roman" w:cs="Times New Roman"/>
           <w:kern w:val="0"/>
         </w:rPr>
-        <w:lastRenderedPageBreak/>
         <w:t xml:space="preserve">Stafford-Bell RE, Chariton AA, Robinson RW (2015) Prolonged buoyancy and viability of </w:t>
       </w:r>
       <w:r>
@@ -18297,6 +18195,7 @@
           <w:rFonts w:ascii="Times New Roman" w:hAnsi="Times New Roman" w:cs="Times New Roman"/>
           <w:kern w:val="0"/>
         </w:rPr>
+        <w:lastRenderedPageBreak/>
         <w:t xml:space="preserve">Trevathan-Tackett SM, Jeffries TC, Macreadie PI, Manojlovic B, Ralph P (2020) Long-term decomposition captures key steps in microbial breakdown of seagrass litter. </w:t>
       </w:r>
       <w:r>
@@ -18332,7 +18231,6 @@
           <w:rFonts w:ascii="Times New Roman" w:hAnsi="Times New Roman" w:cs="Times New Roman"/>
           <w:kern w:val="0"/>
         </w:rPr>
-        <w:lastRenderedPageBreak/>
         <w:t xml:space="preserve">Twigg IM, Baltar F, Hall JR, Hepburn CD (2020) Revealing hydrogen peroxide as an external stressor in macrophyte-dominated coastal ecosystems. </w:t>
       </w:r>
       <w:r>
@@ -18418,23 +18316,7 @@
           <w:rFonts w:ascii="Times New Roman" w:hAnsi="Times New Roman" w:cs="Times New Roman"/>
           <w:kern w:val="0"/>
         </w:rPr>
-        <w:t xml:space="preserve">Vandendriessche S, </w:t>
-      </w:r>
-      <w:proofErr w:type="spellStart"/>
-      <w:r>
-        <w:rPr>
-          <w:rFonts w:ascii="Times New Roman" w:hAnsi="Times New Roman" w:cs="Times New Roman"/>
-          <w:kern w:val="0"/>
-        </w:rPr>
-        <w:t>Vincx</w:t>
-      </w:r>
-      <w:proofErr w:type="spellEnd"/>
-      <w:r>
-        <w:rPr>
-          <w:rFonts w:ascii="Times New Roman" w:hAnsi="Times New Roman" w:cs="Times New Roman"/>
-          <w:kern w:val="0"/>
-        </w:rPr>
-        <w:t xml:space="preserve"> M, Degraer S (2007) Floating seaweed and the influences of temperature, grazing and clump size on raft longevity — a microcosm study. </w:t>
+        <w:t xml:space="preserve">Vandendriessche S, Vincx M, Degraer S (2007) Floating seaweed and the influences of temperature, grazing and clump size on raft longevity — a microcosm study. </w:t>
       </w:r>
       <w:r>
         <w:rPr>
@@ -18674,6 +18556,7 @@
           <w:rFonts w:ascii="Times New Roman" w:hAnsi="Times New Roman" w:cs="Times New Roman"/>
           <w:kern w:val="0"/>
         </w:rPr>
+        <w:lastRenderedPageBreak/>
         <w:t xml:space="preserve">White LJ, Norkko A (2025) A path towards appropriate degradation experiments for assessing carbon sequestration potential of macroalgae. </w:t>
       </w:r>
       <w:r>
@@ -18709,7 +18592,6 @@
           <w:rFonts w:ascii="Times New Roman" w:hAnsi="Times New Roman" w:cs="Times New Roman"/>
           <w:kern w:val="0"/>
         </w:rPr>
-        <w:lastRenderedPageBreak/>
         <w:t xml:space="preserve">Wickham H, Averick M, Bryan J, Chang W, McGowan LD, François R, Grolemund G, Hayes A, Henry L, Hester J (2019) Welcome to the Tidyverse. </w:t>
       </w:r>
       <w:r>
@@ -19183,7 +19065,14 @@
         <w:rPr>
           <w:rFonts w:ascii="Times New Roman" w:hAnsi="Times New Roman" w:cs="Times New Roman"/>
         </w:rPr>
-        <w:t xml:space="preserve">). Lines and intervals are medians and the central 50, 80 and 90% of posterior probability for predicted observations. Distributions are posteriors for initial </w:t>
+        <w:t xml:space="preserve">). Lines and intervals are </w:t>
+      </w:r>
+      <w:r>
+        <w:rPr>
+          <w:rFonts w:ascii="Times New Roman" w:hAnsi="Times New Roman" w:cs="Times New Roman"/>
+        </w:rPr>
+        <w:lastRenderedPageBreak/>
+        <w:t xml:space="preserve">medians and the central 50, 80 and 90% of posterior probability for predicted observations. Distributions are posteriors for initial </w:t>
       </w:r>
       <w:r>
         <w:rPr>
@@ -19698,7 +19587,13 @@
         <w:rPr>
           <w:rFonts w:ascii="Times New Roman" w:hAnsi="Times New Roman" w:cs="Times New Roman"/>
         </w:rPr>
-        <w:t xml:space="preserve">. Percentages are probabilities for </w:t>
+        <w:t xml:space="preserve">. Percentages are </w:t>
+      </w:r>
+      <w:r>
+        <w:rPr>
+          <w:rFonts w:ascii="Times New Roman" w:hAnsi="Times New Roman" w:cs="Times New Roman"/>
+        </w:rPr>
+        <w:t xml:space="preserve">probabilities for </w:t>
       </w:r>
       <w:r>
         <w:rPr>
@@ -19769,6 +19664,18 @@
           <w:rFonts w:ascii="Times New Roman" w:hAnsi="Times New Roman" w:cs="Times New Roman"/>
         </w:rPr>
         <w:t xml:space="preserve"> &gt; 1, depending on what side of the identity line most of the probability lies.</w:t>
+      </w:r>
+      <w:r>
+        <w:rPr>
+          <w:rFonts w:ascii="Times New Roman" w:hAnsi="Times New Roman" w:cs="Times New Roman"/>
+        </w:rPr>
+        <w:t xml:space="preserve"> </w:t>
+      </w:r>
+      <w:r>
+        <w:rPr>
+          <w:rFonts w:ascii="Times New Roman" w:hAnsi="Times New Roman" w:cs="Times New Roman"/>
+        </w:rPr>
+        <w:t>See Figure S3 for an alternative version of the top three panels of this figure with data points on the logarithmic scale.</w:t>
       </w:r>
     </w:p>
     <w:p>
@@ -19880,7 +19787,14 @@
         <w:rPr>
           <w:rFonts w:ascii="Times New Roman" w:hAnsi="Times New Roman" w:cs="Times New Roman"/>
         </w:rPr>
-        <w:t xml:space="preserve"> where</w:t>
+        <w:t xml:space="preserve"> </w:t>
+      </w:r>
+      <w:r>
+        <w:rPr>
+          <w:rFonts w:ascii="Times New Roman" w:hAnsi="Times New Roman" w:cs="Times New Roman"/>
+        </w:rPr>
+        <w:lastRenderedPageBreak/>
+        <w:t>where</w:t>
       </w:r>
       <w:r>
         <w:rPr>
@@ -20014,7 +19928,6 @@
         <w:rPr>
           <w:rFonts w:ascii="Times New Roman" w:hAnsi="Times New Roman" w:cs="Times New Roman"/>
         </w:rPr>
-        <w:lastRenderedPageBreak/>
         <w:fldChar w:fldCharType="begin"/>
       </w:r>
       <w:r>
@@ -21713,6 +21626,11 @@
       <w:bCs/>
     </w:rPr>
   </w:style>
+  <w:style w:type="character" w:customStyle="1" w:styleId="inserted">
+    <w:name w:val="inserted"/>
+    <w:basedOn w:val="DefaultParagraphFont"/>
+    <w:rsid w:val="00AD736E"/>
+  </w:style>
 </w:styles>
 </file>
 

</xml_diff>